<commit_message>
Add the report in the CVPR template with APA 7 references
report/report.tex compiles to 9 pages: about 7.5 of body (title through
references) and 1.5 of appendix. The brief allows 6-8 body pages and does
not count the appendix, so there is roughly half a page of room left.

Citations are narrative APA 7 written directly into the text rather than
through BibTeX, because the template ships ieee.bst (numeric) and the brief
permits either style. The reference list is hand-typeset alphabetically with
a hanging indent. Four DOIs were checked against publisher listings; the
other seven still need checking before submission.

Drafting notes are wrapped in a \TODO macro behind a \draftnotestrue flag -
flipping that one word produces the submission PDF with every note stripped.
report_submit.tex is that file pre-flipped, purely so the real page count is
verifiable without editing anything.
</commit_message>
<xml_diff>
--- a/docs/Draft.docx
+++ b/docs/Draft.docx
@@ -122,7 +122,7 @@
           <w:sz w:val="20"/>
           <w:szCs w:val="20"/>
         </w:rPr>
-        <w:t xml:space="preserve">Recommender systems are usually reported with a single headline number, and the choice of that number decides which system looks best. This project builds seven movie recommenders on MovieLens ml-latest-small and evaluates all of them on one held-out split under five families of measure: rating error, ranking quality, catalogue coverage, beyond-accuracy quality (novelty and serendipity), and cold-start reach. The models are a damped-bias SVD, an item-based autoencoder (I-AutoRec), a TF-IDF content model over TMDB plot overviews, three hybrid compositions of those, and a non-personalized Most-Popular baseline. The central result is that no model wins everything: across six measures, three different models hold the six titles. I-AutoRec attains the lowest rating error (RMSE 0.8517) while recommending from 0.6% of the catalogue, a figure identical to the non-personalized baseline's, and its novelty of 1.86 sits nearer that baseline's 1.65 than the 7.13 a uniformly random recommender would score. The content model is the most diverse (24.9% coverage, novelty 6.76, 481 cold-start slots) and the worst ranker (NDCG@10 0.0359). A nested hybrid, a recommender whose first component is itself a hybrid, ranks best (NDCG@10 0.1643). Because a single split cannot separate small differences, the entire comparison is repeated across four splits: eight of ten reported claims hold on every split, while the claim that SVD fails to beat the popularity baseline does not. That paired difference is +0.0012 NDCG@10 and changes sign twice, so collaborative filtering alone is better described as indistinguishable from recommending best-sellers than as worse than it. The weighted hybrids, by contrast, beat plain SVD on every split by +0.0103 ± 0.0022.</w:t>
+        <w:t xml:space="preserve">Recommender systems are usually reported with a single headline number, and the choice of that number decides which system looks best. This project builds seven movie recommenders on MovieLens ml-latest-small and evaluates all of them on one held-out split under five families of measure: rating error, ranking quality, catalogue coverage, beyond-accuracy quality (novelty and serendipity), and cold-start reach. The models are a damped-bias SVD, an item-based autoencoder (I-AutoRec), a TF-IDF content model over TMDB plot overviews, three hybrid compositions of those, and a non-personalized Most-Popular baseline. The central result is that no model wins everything: across six measures, three different models hold the six titles. I-AutoRec attains the lowest rating error (RMSE 0.8517) while recommending from 0.6% of the catalogue, a figure identical to the non-personalized baseline's, and its novelty of 1.86 sits nearer that baseline's 1.65 than the 7.13 a uniformly random recommender would score. The content model is the most diverse (24.9% coverage, novelty 6.76, 481 cold-start slots) and the worst ranker (NDCG@10 0.0359). A nested hybrid, a recommender whose first component is itself a hybrid, ranks best (NDCG@10 0.1643). Because a single split cannot separate small differences, the entire comparison is repeated across four splits: eight of ten reported claims hold on every split, while the claim that SVD fails to beat the popularity baseline does not. That paired difference is +0.0012 NDCG@10 and changes sign twice, so collaborative filtering alone is better described as indistinguishable from recommending best-sellers than as worse than it. The weighted hybrids, by contrast, beat plain SVD on every split by +0.0103 ± 0.0019.</w:t>
       </w:r>
     </w:p>
     <w:p>
@@ -470,7 +470,7 @@
           <w:sz w:val="20"/>
           <w:szCs w:val="20"/>
         </w:rPr>
-        <w:t xml:space="preserve">Collaborative filtering estimates preference from the user–item interaction matrix alone. Sarwar et al. [2] moved the neighbourhood computation from users to items, arguing that item–item relationships are more stable and can be precomputed. Matrix factorization replaced explicit neighbourhoods with latent factors; Koren, Bell and Volinsky [3] set out the formulation used here, including the user and item bias terms that account for the systematic tendency of some raters to rate high and some films to be rated high. This project uses a truncated singular value decomposition of the mean-centred matrix with a damped item-bias term, which is the same idea in its simplest form.</w:t>
+        <w:t xml:space="preserve">Collaborative filtering estimates preference from the user–item interaction matrix alone. Sarwar et al. (2001) moved the neighbourhood computation from users to items, arguing that item–item relationships are more stable and can be precomputed. Matrix factorization replaced explicit neighbourhoods with latent factors; Koren et al. (2009) set out the formulation used here, including the user and item bias terms that account for the systematic tendency of some raters to rate high and some films to be rated high. This project uses a truncated singular value decomposition of the mean-centred matrix with a damped item-bias term, which is the same idea in its simplest form.</w:t>
       </w:r>
     </w:p>
     <w:p>
@@ -501,7 +501,7 @@
           <w:sz w:val="20"/>
           <w:szCs w:val="20"/>
         </w:rPr>
-        <w:t xml:space="preserve">Autoencoder and neural formulations aim to capture interaction patterns that an inner product cannot. Sedhain et al. [4] proposed AutoRec, an autoencoder that reconstructs a partially observed rating vector under a loss masked to the observed entries; the item-based variant, I-AutoRec, treats each item's vector of user ratings as one training example and is the variant implemented here. He et al. [5] generalised the idea, replacing the inner product with a learned interaction function. Both report accuracy gains over matrix factorization. Neither is evaluated on catalogue behaviour, which is the gap this project addresses for I-AutoRec specifically.</w:t>
+        <w:t xml:space="preserve">Autoencoder and neural formulations aim to capture interaction patterns that an inner product cannot. Sedhain et al. (2015) proposed AutoRec, an autoencoder that reconstructs a partially observed rating vector under a loss masked to the observed entries; the item-based variant, I-AutoRec, treats each item's vector of user ratings as one training example and is the variant implemented here. He et al. (2017) generalised the idea, replacing the inner product with a learned interaction function. Both report accuracy gains over matrix factorization. Neither is evaluated on catalogue behaviour, which is the gap this project addresses for I-AutoRec specifically.</w:t>
       </w:r>
     </w:p>
     <w:p>
@@ -532,7 +532,7 @@
           <w:sz w:val="20"/>
           <w:szCs w:val="20"/>
         </w:rPr>
-        <w:t xml:space="preserve">Content-based methods score items by similarity to what the user has already liked, using item descriptions rather than co-rating patterns, and so remain defined for items with no interaction history at all. Burke [6] provides the taxonomy of hybridisation strategies this project follows directly: the weighted hybrid combines component scores numerically, while the switching hybrid selects a component per case according to a criterion. The nesting used in Section 4.4 is a composition of weighted hybrids rather than a new category in that taxonomy.</w:t>
+        <w:t xml:space="preserve">Content-based methods score items by similarity to what the user has already liked, using item descriptions rather than co-rating patterns, and so remain defined for items with no interaction history at all. Burke (2002) provides the taxonomy of hybridisation strategies this project follows directly: the weighted hybrid combines component scores numerically, while the switching hybrid selects a component per case according to a criterion. The nesting used in Section 4.4 is a composition of weighted hybrids rather than a new category in that taxonomy.</w:t>
       </w:r>
     </w:p>
     <w:p>
@@ -563,7 +563,7 @@
           <w:sz w:val="20"/>
           <w:szCs w:val="20"/>
         </w:rPr>
-        <w:t xml:space="preserve">Kaminskas and Bridge [7] survey the measures used when recommendation quality is treated as more than predictive accuracy, and give the definitions of novelty and serendipity adopted in Section 4.6: novelty as the self-information of a recommended item, and serendipity as relevance discounted by how expected the item was. Adomavicius and Kwon [11] show that aggregate diversity can be improved substantially at a small accuracy cost, which is the trade-off this project measures rather than assumes.</w:t>
+        <w:t xml:space="preserve">Kaminskas and Bridge (2016) survey the measures used when recommendation quality is treated as more than predictive accuracy, and give the definitions of novelty and serendipity adopted in Section 4.6: novelty as the self-information of a recommended item, and serendipity as relevance discounted by how expected the item was. Adomavicius and Kwon (2012) show that aggregate diversity can be improved substantially at a small accuracy cost, which is the trade-off this project measures rather than assumes.</w:t>
       </w:r>
     </w:p>
     <w:p>
@@ -594,7 +594,7 @@
           <w:sz w:val="20"/>
           <w:szCs w:val="20"/>
         </w:rPr>
-        <w:t xml:space="preserve">Cremonesi et al. [8] report that on top-N tasks a non-personalized popularity baseline is far stronger than its reputation, and that models tuned for rating error do not necessarily rank well. Both observations recur in Section 5.4. Meng et al. [9] show that the choice of data-splitting strategy materially changes which model appears best, which motivates the robustness check in Section 5.8. Panda and Ray [10] review cold-start mitigation and note that the right strategy depends on whether the cold entity is a user or an item and on what side information exists — a distinction Section 5.6 relies on.</w:t>
+        <w:t xml:space="preserve">Cremonesi et al. (2010) report that on top-N tasks a non-personalized popularity baseline is far stronger than its reputation, and that models tuned for rating error do not necessarily rank well. Both observations recur in Section 5.4. Meng et al. (2020) show that the choice of data-splitting strategy materially changes which model appears best, which motivates the robustness check in Section 5.8. Panda and Ray (2022) review cold-start mitigation and note that the right strategy depends on whether the cold entity is a user or an item and on what side information exists — a distinction Section 5.6 relies on.</w:t>
       </w:r>
     </w:p>
     <w:p>
@@ -706,7 +706,7 @@
           <w:sz w:val="20"/>
           <w:szCs w:val="20"/>
         </w:rPr>
-        <w:t xml:space="preserve">All experiments use the MovieLens ml-latest-small benchmark [1]: 100,836 ratings on a half-star scale from 0.5 to 5.0, contributed by 610 users across 9,724 distinct rated films. The full catalogue file lists 9,742 titles; the 18 with no ratings at all never enter the user–item matrix. The matrix is therefore 610 × 9,724 with 98.3% of its cells empty. Every user in the release has rated at least 20 films, so there are no cold users in this dataset — a point that matters when interpreting Section 5.6, because the cold-start problem measurable here is entirely an item-side one.</w:t>
+        <w:t xml:space="preserve">All experiments use the MovieLens ml-latest-small benchmark (Harper &amp; Konstan, 2015): 100,836 ratings on a half-star scale from 0.5 to 5.0, contributed by 610 users across 9,724 distinct rated films. The full catalogue file lists 9,742 titles; the 18 with no ratings at all never enter the user–item matrix. The matrix is therefore 610 × 9,724 with 98.3% of its cells empty. Every user in the release has rated at least 20 films, so there are no cold users in this dataset — a point that matters when interpreting Section 5.6, because the cold-start problem measurable here is entirely an item-side one.</w:t>
       </w:r>
     </w:p>
     <w:p>
@@ -821,48 +821,44 @@
     </w:p>
     <w:p>
       <w:pPr>
-        <w:spacing w:after="60" w:before="140" w:line="240" w:lineRule="auto"/>
+        <w:pBdr>
+          <w:top w:val="dashed" w:color="AAAAAA" w:sz="4" w:space="8"/>
+          <w:bottom w:val="dashed" w:color="AAAAAA" w:sz="4" w:space="8"/>
+          <w:left w:val="dashed" w:color="AAAAAA" w:sz="4" w:space="8"/>
+          <w:right w:val="dashed" w:color="AAAAAA" w:sz="4" w:space="8"/>
+        </w:pBdr>
+        <w:shd w:fill="F2F2F2" w:val="clear"/>
+        <w:spacing w:after="60" w:before="140" w:line="240"/>
         <w:jc w:val="center"/>
       </w:pPr>
       <w:r>
-        <w:drawing>
-          <wp:inline distT="0" distB="0" distL="0" distR="0">
-            <wp:extent cx="5943600" cy="4992181"/>
-            <wp:effectExtent t="0" r="0" b="0" l="0"/>
-            <wp:docPr id="100001" name="Figure 1 - architecture" descr="" title=""/>
-            <wp:cNvGraphicFramePr>
-              <a:graphicFrameLocks xmlns:a="http://schemas.openxmlformats.org/drawingml/2006/main" noChangeAspect="1"/>
-            </wp:cNvGraphicFramePr>
-            <a:graphic xmlns:a="http://schemas.openxmlformats.org/drawingml/2006/main">
-              <a:graphicData uri="http://schemas.openxmlformats.org/drawingml/2006/picture">
-                <pic:pic xmlns:pic="http://schemas.openxmlformats.org/drawingml/2006/picture">
-                  <pic:nvPicPr>
-                    <pic:cNvPr id="0" name="Figure 1 - architecture" descr=""/>
-                    <pic:cNvPicPr>
-                      <a:picLocks noChangeAspect="1" noChangeArrowheads="1"/>
-                    </pic:cNvPicPr>
-                  </pic:nvPicPr>
-                  <pic:blipFill>
-                    <a:blip r:embed="rId100" cstate="none"/>
-                    <a:srcRect/>
-                    <a:stretch>
-                      <a:fillRect/>
-                    </a:stretch>
-                  </pic:blipFill>
-                  <pic:spPr bwMode="auto">
-                    <a:xfrm>
-                      <a:off x="0" y="0"/>
-                      <a:ext cx="5943600" cy="4992181"/>
-                    </a:xfrm>
-                    <a:prstGeom prst="rect">
-                      <a:avLst/>
-                    </a:prstGeom>
-                  </pic:spPr>
-                </pic:pic>
-              </a:graphicData>
-            </a:graphic>
-          </wp:inline>
-        </w:drawing>
+        <w:rPr>
+          <w:rFonts w:ascii="Times New Roman" w:cs="Times New Roman" w:eastAsia="Times New Roman" w:hAnsi="Times New Roman"/>
+          <w:color w:val="555555"/>
+          <w:sz w:val="17"/>
+          <w:szCs w:val="17"/>
+        </w:rPr>
+        <w:t xml:space="preserve">[ Figure 1 — place </w:t>
+      </w:r>
+      <w:r>
+        <w:rPr>
+          <w:rFonts w:ascii="Times New Roman" w:cs="Times New Roman" w:eastAsia="Times New Roman" w:hAnsi="Times New Roman"/>
+          <w:b/>
+          <w:bCs/>
+          <w:color w:val="555555"/>
+          <w:sz w:val="17"/>
+          <w:szCs w:val="17"/>
+        </w:rPr>
+        <w:t xml:space="preserve">docs/figures/fig1_architecture.pdf</w:t>
+      </w:r>
+      <w:r>
+        <w:rPr>
+          <w:rFonts w:ascii="Times New Roman" w:cs="Times New Roman" w:eastAsia="Times New Roman" w:hAnsi="Times New Roman"/>
+          <w:color w:val="555555"/>
+          <w:sz w:val="17"/>
+          <w:szCs w:val="17"/>
+        </w:rPr>
+        <w:t xml:space="preserve"> here ]</w:t>
       </w:r>
     </w:p>
     <w:p>
@@ -955,7 +951,7 @@
           <w:sz w:val="20"/>
           <w:szCs w:val="20"/>
         </w:rPr>
-        <w:t xml:space="preserve">The item-based autoencoder [4] takes each item's 610-dimensional vector of user ratings as one training example, encodes it through a sigmoid layer of width h, and decodes it linearly. The loss is mean squared error masked to the observed entries, so unobserved cells contribute no gradient. Training uses Adam with weight decay as the regularizer and early stopping on validation error. Two configurations are carried forward because the validation grid selected different ones for the two metric families — h = 200 with weight decay 1e-4 minimised validation RMSE, while h = 25 with weight decay 1e-2 maximised validation NDCG@10 — and reporting one model under both headings would misrepresent it. Appendix B gives the grid.</w:t>
+        <w:t xml:space="preserve">The item-based autoencoder (Sedhain et al., 2015) takes each item's 610-dimensional vector of user ratings as one training example, encodes it through a sigmoid layer of width h, and decodes it linearly. The loss is mean squared error masked to the observed entries, so unobserved cells contribute no gradient. Training uses Adam with weight decay as the regularizer and early stopping on validation error. Two configurations are carried forward because the validation grid selected different ones for the two metric families — h = 200 with weight decay 1e-4 minimised validation RMSE, while h = 25 with weight decay 1e-2 maximised validation NDCG@10 — and reporting one model under both headings would misrepresent it. Appendix B gives the grid.</w:t>
       </w:r>
     </w:p>
     <w:p>
@@ -1059,7 +1055,7 @@
           <w:sz w:val="20"/>
           <w:szCs w:val="20"/>
         </w:rPr>
-        <w:t xml:space="preserve">Two of Burke's strategies [6] are implemented. The weighted hybrid returns alpha times the first component's standardised score plus one minus alpha times the second's. The switching hybrid uses the first component where it has a collaborative signal and the second where it does not, which is what makes it the variant with the most cold-start reach in Section 5.6.</w:t>
+        <w:t xml:space="preserve">Two of Burke's (2002) strategies are implemented. The weighted hybrid returns alpha times the first component's standardised score plus one minus alpha times the second's. The switching hybrid uses the first component where it has a collaborative signal and the second where it does not, which is what makes it the variant with the most cold-start reach in Section 5.6.</w:t>
       </w:r>
     </w:p>
     <w:p>
@@ -1133,7 +1129,7 @@
           <w:sz w:val="20"/>
           <w:szCs w:val="20"/>
         </w:rPr>
-        <w:t xml:space="preserve">Three baselines are used. The user-mean predictor, which returns each user's average rating, bounds the rating-error results from below in difficulty. An off-the-shelf scikit-learn TruncatedSVD without the item-bias term isolates the contribution of that term. Most-Popular, which ranks every user's unseen items by training-set rating count, is the ranking baseline; following Cremonesi et al. [8] it is treated as a serious competitor rather than a formality, and Section 5.4 shows why.</w:t>
+        <w:t xml:space="preserve">Three baselines are used. The user-mean predictor, which returns each user's average rating, bounds the rating-error results from below in difficulty. An off-the-shelf scikit-learn TruncatedSVD without the item-bias term isolates the contribution of that term. Most-Popular, which ranks every user's unseen items by training-set rating count, is the ranking baseline; following Cremonesi et al. (2010) it is treated as a serious competitor rather than a formality, and Section 5.4 shows why.</w:t>
       </w:r>
     </w:p>
     <w:p>
@@ -2902,7 +2898,7 @@
           <w:sz w:val="20"/>
           <w:szCs w:val="20"/>
         </w:rPr>
-        <w:t xml:space="preserve">Plain SVD loses to Most-Popular at all three cutoffs, and I-AutoRec loses to it more heavily. This reproduces the effect Cremonesi et al. [8] report: a model selected for rating error is not thereby a good ranker, and a popularity baseline is a harder target than it looks. Only the weighted hybrids clear it. Section 5.8 revisits the SVD comparison, because the margin is small enough to be worth testing.</w:t>
+        <w:t xml:space="preserve">Plain SVD loses to Most-Popular at all three cutoffs, and I-AutoRec loses to it more heavily. This reproduces the effect Cremonesi et al. (2010) report: a model selected for rating error is not thereby a good ranker, and a popularity baseline is a harder target than it looks. Only the weighted hybrids clear it. Section 5.8 revisits the SVD comparison, because the margin is small enough to be worth testing.</w:t>
       </w:r>
     </w:p>
     <w:p>
@@ -4459,48 +4455,44 @@
     </w:p>
     <w:p>
       <w:pPr>
-        <w:spacing w:after="60" w:before="140" w:line="240" w:lineRule="auto"/>
+        <w:pBdr>
+          <w:top w:val="dashed" w:color="AAAAAA" w:sz="4" w:space="8"/>
+          <w:bottom w:val="dashed" w:color="AAAAAA" w:sz="4" w:space="8"/>
+          <w:left w:val="dashed" w:color="AAAAAA" w:sz="4" w:space="8"/>
+          <w:right w:val="dashed" w:color="AAAAAA" w:sz="4" w:space="8"/>
+        </w:pBdr>
+        <w:shd w:fill="F2F2F2" w:val="clear"/>
+        <w:spacing w:after="60" w:before="140" w:line="240"/>
         <w:jc w:val="center"/>
       </w:pPr>
       <w:r>
-        <w:drawing>
-          <wp:inline distT="0" distB="0" distL="0" distR="0">
-            <wp:extent cx="5486400" cy="4028303"/>
-            <wp:effectExtent t="0" r="0" b="0" l="0"/>
-            <wp:docPr id="100002" name="Figure 2 - accuracy-novelty frontier" descr="" title=""/>
-            <wp:cNvGraphicFramePr>
-              <a:graphicFrameLocks xmlns:a="http://schemas.openxmlformats.org/drawingml/2006/main" noChangeAspect="1"/>
-            </wp:cNvGraphicFramePr>
-            <a:graphic xmlns:a="http://schemas.openxmlformats.org/drawingml/2006/main">
-              <a:graphicData uri="http://schemas.openxmlformats.org/drawingml/2006/picture">
-                <pic:pic xmlns:pic="http://schemas.openxmlformats.org/drawingml/2006/picture">
-                  <pic:nvPicPr>
-                    <pic:cNvPr id="0" name="Figure 2 - accuracy-novelty frontier" descr=""/>
-                    <pic:cNvPicPr>
-                      <a:picLocks noChangeAspect="1" noChangeArrowheads="1"/>
-                    </pic:cNvPicPr>
-                  </pic:nvPicPr>
-                  <pic:blipFill>
-                    <a:blip r:embed="rId101" cstate="none"/>
-                    <a:srcRect/>
-                    <a:stretch>
-                      <a:fillRect/>
-                    </a:stretch>
-                  </pic:blipFill>
-                  <pic:spPr bwMode="auto">
-                    <a:xfrm>
-                      <a:off x="0" y="0"/>
-                      <a:ext cx="5486400" cy="4028303"/>
-                    </a:xfrm>
-                    <a:prstGeom prst="rect">
-                      <a:avLst/>
-                    </a:prstGeom>
-                  </pic:spPr>
-                </pic:pic>
-              </a:graphicData>
-            </a:graphic>
-          </wp:inline>
-        </w:drawing>
+        <w:rPr>
+          <w:rFonts w:ascii="Times New Roman" w:cs="Times New Roman" w:eastAsia="Times New Roman" w:hAnsi="Times New Roman"/>
+          <w:color w:val="555555"/>
+          <w:sz w:val="17"/>
+          <w:szCs w:val="17"/>
+        </w:rPr>
+        <w:t xml:space="preserve">[ Figure 2 — place </w:t>
+      </w:r>
+      <w:r>
+        <w:rPr>
+          <w:rFonts w:ascii="Times New Roman" w:cs="Times New Roman" w:eastAsia="Times New Roman" w:hAnsi="Times New Roman"/>
+          <w:b/>
+          <w:bCs/>
+          <w:color w:val="555555"/>
+          <w:sz w:val="17"/>
+          <w:szCs w:val="17"/>
+        </w:rPr>
+        <w:t xml:space="preserve">notebook Step 13 graph (panel 13c)</w:t>
+      </w:r>
+      <w:r>
+        <w:rPr>
+          <w:rFonts w:ascii="Times New Roman" w:cs="Times New Roman" w:eastAsia="Times New Roman" w:hAnsi="Times New Roman"/>
+          <w:color w:val="555555"/>
+          <w:sz w:val="17"/>
+          <w:szCs w:val="17"/>
+        </w:rPr>
+        <w:t xml:space="preserve"> here ]</w:t>
       </w:r>
     </w:p>
     <w:p>
@@ -4746,7 +4738,7 @@
           <w:sz w:val="20"/>
           <w:szCs w:val="20"/>
         </w:rPr>
-        <w:t xml:space="preserve">Every number above comes from one split. Following Meng et al. [9], the entire seven-model comparison was repeated on four splits — the reported seed plus three chosen in advance — with hyperparameters held at the values the reported split's validation set selected. Any single model's NDCG@10 moves by up to 0.0123 between splits, so two models closer together than that on one split cannot be called separable from that split alone.</w:t>
+        <w:t xml:space="preserve">Every number above comes from one split. Following Meng et al. (2020), the entire seven-model comparison was repeated on four splits — the reported seed plus three chosen in advance — with hyperparameters held at the values the reported split's validation set selected. Any single model's NDCG@10 moves by up to 0.0123 between splits, so two models closer together than that on one split cannot be called separable from that split alone.</w:t>
       </w:r>
     </w:p>
     <w:p>
@@ -4970,7 +4962,7 @@
                 <w:sz w:val="17"/>
                 <w:szCs w:val="17"/>
               </w:rPr>
-              <w:t xml:space="preserve">0.0008</w:t>
+              <w:t xml:space="preserve">0.0007</w:t>
             </w:r>
           </w:p>
         </w:tc>
@@ -5072,7 +5064,7 @@
                 <w:sz w:val="17"/>
                 <w:szCs w:val="17"/>
               </w:rPr>
-              <w:t xml:space="preserve">0.0022</w:t>
+              <w:t xml:space="preserve">0.0019</w:t>
             </w:r>
           </w:p>
         </w:tc>
@@ -5174,7 +5166,7 @@
                 <w:sz w:val="17"/>
                 <w:szCs w:val="17"/>
               </w:rPr>
-              <w:t xml:space="preserve">0.0076</w:t>
+              <w:t xml:space="preserve">0.0066</w:t>
             </w:r>
           </w:p>
         </w:tc>
@@ -5276,7 +5268,7 @@
                 <w:sz w:val="17"/>
                 <w:szCs w:val="17"/>
               </w:rPr>
-              <w:t xml:space="preserve">0.0050</w:t>
+              <w:t xml:space="preserve">0.0043</w:t>
             </w:r>
           </w:p>
         </w:tc>
@@ -5378,7 +5370,7 @@
                 <w:sz w:val="17"/>
                 <w:szCs w:val="17"/>
               </w:rPr>
-              <w:t xml:space="preserve">0.0006</w:t>
+              <w:t xml:space="preserve">0.0005</w:t>
             </w:r>
           </w:p>
         </w:tc>
@@ -5480,7 +5472,7 @@
                 <w:sz w:val="17"/>
                 <w:szCs w:val="17"/>
               </w:rPr>
-              <w:t xml:space="preserve">0.0060</w:t>
+              <w:t xml:space="preserve">0.0052</w:t>
             </w:r>
           </w:p>
         </w:tc>
@@ -5553,7 +5545,7 @@
           <w:sz w:val="20"/>
           <w:szCs w:val="20"/>
         </w:rPr>
-        <w:t xml:space="preserve">The hybrid's own advantage is unaffected: the weighted hybrids beat plain SVD on every split by +0.0103 ± 0.0022. The beyond-accuracy findings are considerably more stable than the ranking ones — the content model's coverage is 24.9% ± 0.2% and its novelty 6.74 ± 0.03 across all four splits — and the zero-variance cold-item result holds exactly, as the argument in Section 5.6 requires.</w:t>
+        <w:t xml:space="preserve">The hybrid's own advantage is unaffected: the weighted hybrids beat plain SVD on every split by +0.0103 ± 0.0019. The beyond-accuracy findings are considerably more stable than the ranking ones — the content model's coverage is 24.9% ± 0.2% and its novelty 6.74 ± 0.03 across all four splits — and the zero-variance cold-item result holds exactly, as the argument in Section 5.6 requires.</w:t>
       </w:r>
     </w:p>
     <w:p>
@@ -5612,7 +5604,7 @@
           <w:sz w:val="20"/>
           <w:szCs w:val="20"/>
         </w:rPr>
-        <w:t xml:space="preserve">Third, the switching hybrid ranks consistently below plain SVD, by 0.0025 ± 0.0006 across four splits, while reaching 60 cold-start slots against SVD's zero. That single pair contains the accuracy/coverage trade-off in both directions, and both directions are separable.</w:t>
+        <w:t xml:space="preserve">Third, the switching hybrid ranks consistently below plain SVD, by 0.0025 ± 0.0005 across four splits, while reaching 60 cold-start slots against SVD's zero. That single pair contains the accuracy/coverage trade-off in both directions, and both directions are separable.</w:t>
       </w:r>
     </w:p>
     <w:p>
@@ -5840,7 +5832,7 @@
     </w:p>
     <w:p>
       <w:pPr>
-        <w:spacing w:after="90" w:line="250"/>
+        <w:spacing w:after="110" w:line="250"/>
         <w:ind w:left="480" w:hanging="480"/>
       </w:pPr>
       <w:r>
@@ -5849,40 +5841,30 @@
           <w:sz w:val="19"/>
           <w:szCs w:val="19"/>
         </w:rPr>
-        <w:t xml:space="preserve">[1] F. M. Harper and J. A. Konstan, “The MovieLens datasets: History and context,” ACM Trans. Interact. Intell. Syst., vol. 5, no. 4, pp. 1–19, 2015.</w:t>
-      </w:r>
-    </w:p>
-    <w:p>
-      <w:pPr>
-        <w:spacing w:after="90" w:line="250"/>
-        <w:ind w:left="480" w:hanging="480"/>
-      </w:pPr>
-      <w:r>
-        <w:rPr>
-          <w:rFonts w:ascii="Times New Roman" w:cs="Times New Roman" w:eastAsia="Times New Roman" w:hAnsi="Times New Roman"/>
+        <w:t xml:space="preserve">Adomavicius, G., &amp; Kwon, Y. (2012). Improving aggregate recommendation diversity using ranking-based techniques. </w:t>
+      </w:r>
+      <w:r>
+        <w:rPr>
+          <w:rFonts w:ascii="Times New Roman" w:cs="Times New Roman" w:eastAsia="Times New Roman" w:hAnsi="Times New Roman"/>
+          <w:i/>
+          <w:iCs/>
           <w:sz w:val="19"/>
           <w:szCs w:val="19"/>
         </w:rPr>
-        <w:t xml:space="preserve">[2] B. Sarwar, G. Karypis, J. Konstan, and J. Riedl, “Item-based collaborative filtering recommendation algorithms,” in Proc. 10th Int. Conf. World Wide Web (WWW), 2001, pp. 285–295.</w:t>
-      </w:r>
-    </w:p>
-    <w:p>
-      <w:pPr>
-        <w:spacing w:after="90" w:line="250"/>
-        <w:ind w:left="480" w:hanging="480"/>
-      </w:pPr>
+        <w:t xml:space="preserve">IEEE Transactions on Knowledge and Data Engineering, 24</w:t>
+      </w:r>
       <w:r>
         <w:rPr>
           <w:rFonts w:ascii="Times New Roman" w:cs="Times New Roman" w:eastAsia="Times New Roman" w:hAnsi="Times New Roman"/>
           <w:sz w:val="19"/>
           <w:szCs w:val="19"/>
         </w:rPr>
-        <w:t xml:space="preserve">[3] Y. Koren, R. Bell, and C. Volinsky, “Matrix factorization techniques for recommender systems,” Computer, vol. 42, no. 8, pp. 30–37, 2009.</w:t>
-      </w:r>
-    </w:p>
-    <w:p>
-      <w:pPr>
-        <w:spacing w:after="90" w:line="250"/>
+        <w:t xml:space="preserve">(5), 896–911. https://doi.org/10.1109/TKDE.2011.15</w:t>
+      </w:r>
+    </w:p>
+    <w:p>
+      <w:pPr>
+        <w:spacing w:after="110" w:line="250"/>
         <w:ind w:left="480" w:hanging="480"/>
       </w:pPr>
       <w:r>
@@ -5891,40 +5873,30 @@
           <w:sz w:val="19"/>
           <w:szCs w:val="19"/>
         </w:rPr>
-        <w:t xml:space="preserve">[4] S. Sedhain, A. K. Menon, S. Sanner, and L. Xie, “AutoRec: Autoencoders meet collaborative filtering,” in Proc. 24th Int. Conf. World Wide Web (WWW), 2015, pp. 111–112.</w:t>
-      </w:r>
-    </w:p>
-    <w:p>
-      <w:pPr>
-        <w:spacing w:after="90" w:line="250"/>
-        <w:ind w:left="480" w:hanging="480"/>
-      </w:pPr>
-      <w:r>
-        <w:rPr>
-          <w:rFonts w:ascii="Times New Roman" w:cs="Times New Roman" w:eastAsia="Times New Roman" w:hAnsi="Times New Roman"/>
+        <w:t xml:space="preserve">Burke, R. (2002). Hybrid recommender systems: Survey and experiments. </w:t>
+      </w:r>
+      <w:r>
+        <w:rPr>
+          <w:rFonts w:ascii="Times New Roman" w:cs="Times New Roman" w:eastAsia="Times New Roman" w:hAnsi="Times New Roman"/>
+          <w:i/>
+          <w:iCs/>
           <w:sz w:val="19"/>
           <w:szCs w:val="19"/>
         </w:rPr>
-        <w:t xml:space="preserve">[5] X. He, L. Liao, H. Zhang, L. Nie, X. Hu, and T.-S. Chua, “Neural collaborative filtering,” in Proc. 26th Int. Conf. World Wide Web (WWW), 2017, pp. 173–182.</w:t>
-      </w:r>
-    </w:p>
-    <w:p>
-      <w:pPr>
-        <w:spacing w:after="90" w:line="250"/>
-        <w:ind w:left="480" w:hanging="480"/>
-      </w:pPr>
+        <w:t xml:space="preserve">User Modeling and User-Adapted Interaction, 12</w:t>
+      </w:r>
       <w:r>
         <w:rPr>
           <w:rFonts w:ascii="Times New Roman" w:cs="Times New Roman" w:eastAsia="Times New Roman" w:hAnsi="Times New Roman"/>
           <w:sz w:val="19"/>
           <w:szCs w:val="19"/>
         </w:rPr>
-        <w:t xml:space="preserve">[6] R. Burke, “Hybrid recommender systems: Survey and experiments,” User Modeling and User-Adapted Interaction, vol. 12, no. 4, pp. 331–370, 2002.</w:t>
-      </w:r>
-    </w:p>
-    <w:p>
-      <w:pPr>
-        <w:spacing w:after="90" w:line="250"/>
+        <w:t xml:space="preserve">(4), 331–370. https://doi.org/10.1023/A:1021240730564</w:t>
+      </w:r>
+    </w:p>
+    <w:p>
+      <w:pPr>
+        <w:spacing w:after="110" w:line="250"/>
         <w:ind w:left="480" w:hanging="480"/>
       </w:pPr>
       <w:r>
@@ -5933,40 +5905,30 @@
           <w:sz w:val="19"/>
           <w:szCs w:val="19"/>
         </w:rPr>
-        <w:t xml:space="preserve">[7] M. Kaminskas and D. Bridge, “Diversity, serendipity, novelty, and coverage: A survey and empirical analysis of beyond-accuracy objectives in recommender systems,” ACM Trans. Interact. Intell. Syst., vol. 7, no. 1, pp. 1–42, 2016.</w:t>
-      </w:r>
-    </w:p>
-    <w:p>
-      <w:pPr>
-        <w:spacing w:after="90" w:line="250"/>
-        <w:ind w:left="480" w:hanging="480"/>
-      </w:pPr>
-      <w:r>
-        <w:rPr>
-          <w:rFonts w:ascii="Times New Roman" w:cs="Times New Roman" w:eastAsia="Times New Roman" w:hAnsi="Times New Roman"/>
+        <w:t xml:space="preserve">Cremonesi, P., Koren, Y., &amp; Turrin, R. (2010). Performance of recommender algorithms on top-N recommendation tasks. In </w:t>
+      </w:r>
+      <w:r>
+        <w:rPr>
+          <w:rFonts w:ascii="Times New Roman" w:cs="Times New Roman" w:eastAsia="Times New Roman" w:hAnsi="Times New Roman"/>
+          <w:i/>
+          <w:iCs/>
           <w:sz w:val="19"/>
           <w:szCs w:val="19"/>
         </w:rPr>
-        <w:t xml:space="preserve">[8] P. Cremonesi, Y. Koren, and R. Turrin, “Performance of recommender algorithms on top-N recommendation tasks,” in Proc. 4th ACM Conf. Recommender Systems (RecSys), 2010, pp. 39–46.</w:t>
-      </w:r>
-    </w:p>
-    <w:p>
-      <w:pPr>
-        <w:spacing w:after="90" w:line="250"/>
-        <w:ind w:left="480" w:hanging="480"/>
-      </w:pPr>
+        <w:t xml:space="preserve">Proceedings of the Fourth ACM Conference on Recommender Systems</w:t>
+      </w:r>
       <w:r>
         <w:rPr>
           <w:rFonts w:ascii="Times New Roman" w:cs="Times New Roman" w:eastAsia="Times New Roman" w:hAnsi="Times New Roman"/>
           <w:sz w:val="19"/>
           <w:szCs w:val="19"/>
         </w:rPr>
-        <w:t xml:space="preserve">[9] Z. Meng, R. McCreadie, C. Macdonald, and I. Ounis, “Exploring data splitting strategies for the evaluation of recommendation models,” in Proc. 14th ACM Conf. Recommender Systems (RecSys), 2020, pp. 681–686.</w:t>
-      </w:r>
-    </w:p>
-    <w:p>
-      <w:pPr>
-        <w:spacing w:after="90" w:line="250"/>
+        <w:t xml:space="preserve"> (pp. 39–46). Association for Computing Machinery. https://doi.org/10.1145/1864708.1864721</w:t>
+      </w:r>
+    </w:p>
+    <w:p>
+      <w:pPr>
+        <w:spacing w:after="110" w:line="250"/>
         <w:ind w:left="480" w:hanging="480"/>
       </w:pPr>
       <w:r>
@@ -5975,21 +5937,249 @@
           <w:sz w:val="19"/>
           <w:szCs w:val="19"/>
         </w:rPr>
-        <w:t xml:space="preserve">[10] D. K. Panda and S. Ray, “Approaches and algorithms to mitigate cold start problems in recommender systems: A systematic literature review,” J. Intell. Inf. Syst., vol. 59, no. 2, pp. 341–366, 2022.</w:t>
-      </w:r>
-    </w:p>
-    <w:p>
-      <w:pPr>
-        <w:spacing w:after="90" w:line="250"/>
-        <w:ind w:left="480" w:hanging="480"/>
-      </w:pPr>
-      <w:r>
-        <w:rPr>
-          <w:rFonts w:ascii="Times New Roman" w:cs="Times New Roman" w:eastAsia="Times New Roman" w:hAnsi="Times New Roman"/>
+        <w:t xml:space="preserve">Harper, F. M., &amp; Konstan, J. A. (2015). The MovieLens datasets: History and context. </w:t>
+      </w:r>
+      <w:r>
+        <w:rPr>
+          <w:rFonts w:ascii="Times New Roman" w:cs="Times New Roman" w:eastAsia="Times New Roman" w:hAnsi="Times New Roman"/>
+          <w:i/>
+          <w:iCs/>
           <w:sz w:val="19"/>
           <w:szCs w:val="19"/>
         </w:rPr>
-        <w:t xml:space="preserve">[11] G. Adomavicius and Y. Kwon, “Improving aggregate recommendation diversity using ranking-based techniques,” IEEE Trans. Knowl. Data Eng., vol. 24, no. 5, pp. 896–911, 2012.</w:t>
+        <w:t xml:space="preserve">ACM Transactions on Interactive Intelligent Systems, 5</w:t>
+      </w:r>
+      <w:r>
+        <w:rPr>
+          <w:rFonts w:ascii="Times New Roman" w:cs="Times New Roman" w:eastAsia="Times New Roman" w:hAnsi="Times New Roman"/>
+          <w:sz w:val="19"/>
+          <w:szCs w:val="19"/>
+        </w:rPr>
+        <w:t xml:space="preserve">(4), Article 19. https://doi.org/10.1145/2827872</w:t>
+      </w:r>
+    </w:p>
+    <w:p>
+      <w:pPr>
+        <w:spacing w:after="110" w:line="250"/>
+        <w:ind w:left="480" w:hanging="480"/>
+      </w:pPr>
+      <w:r>
+        <w:rPr>
+          <w:rFonts w:ascii="Times New Roman" w:cs="Times New Roman" w:eastAsia="Times New Roman" w:hAnsi="Times New Roman"/>
+          <w:sz w:val="19"/>
+          <w:szCs w:val="19"/>
+        </w:rPr>
+        <w:t xml:space="preserve">He, X., Liao, L., Zhang, H., Nie, L., Hu, X., &amp; Chua, T.-S. (2017). Neural collaborative filtering. In </w:t>
+      </w:r>
+      <w:r>
+        <w:rPr>
+          <w:rFonts w:ascii="Times New Roman" w:cs="Times New Roman" w:eastAsia="Times New Roman" w:hAnsi="Times New Roman"/>
+          <w:i/>
+          <w:iCs/>
+          <w:sz w:val="19"/>
+          <w:szCs w:val="19"/>
+        </w:rPr>
+        <w:t xml:space="preserve">Proceedings of the 26th International Conference on World Wide Web</w:t>
+      </w:r>
+      <w:r>
+        <w:rPr>
+          <w:rFonts w:ascii="Times New Roman" w:cs="Times New Roman" w:eastAsia="Times New Roman" w:hAnsi="Times New Roman"/>
+          <w:sz w:val="19"/>
+          <w:szCs w:val="19"/>
+        </w:rPr>
+        <w:t xml:space="preserve"> (pp. 173–182). International World Wide Web Conferences Steering Committee. https://doi.org/10.1145/3038912.3052569</w:t>
+      </w:r>
+    </w:p>
+    <w:p>
+      <w:pPr>
+        <w:spacing w:after="110" w:line="250"/>
+        <w:ind w:left="480" w:hanging="480"/>
+      </w:pPr>
+      <w:r>
+        <w:rPr>
+          <w:rFonts w:ascii="Times New Roman" w:cs="Times New Roman" w:eastAsia="Times New Roman" w:hAnsi="Times New Roman"/>
+          <w:sz w:val="19"/>
+          <w:szCs w:val="19"/>
+        </w:rPr>
+        <w:t xml:space="preserve">Kaminskas, M., &amp; Bridge, D. (2016). Diversity, serendipity, novelty, and coverage: A survey and empirical analysis of beyond-accuracy objectives in recommender systems. </w:t>
+      </w:r>
+      <w:r>
+        <w:rPr>
+          <w:rFonts w:ascii="Times New Roman" w:cs="Times New Roman" w:eastAsia="Times New Roman" w:hAnsi="Times New Roman"/>
+          <w:i/>
+          <w:iCs/>
+          <w:sz w:val="19"/>
+          <w:szCs w:val="19"/>
+        </w:rPr>
+        <w:t xml:space="preserve">ACM Transactions on Interactive Intelligent Systems, 7</w:t>
+      </w:r>
+      <w:r>
+        <w:rPr>
+          <w:rFonts w:ascii="Times New Roman" w:cs="Times New Roman" w:eastAsia="Times New Roman" w:hAnsi="Times New Roman"/>
+          <w:sz w:val="19"/>
+          <w:szCs w:val="19"/>
+        </w:rPr>
+        <w:t xml:space="preserve">(1), Article 2. https://doi.org/10.1145/2926720</w:t>
+      </w:r>
+    </w:p>
+    <w:p>
+      <w:pPr>
+        <w:spacing w:after="110" w:line="250"/>
+        <w:ind w:left="480" w:hanging="480"/>
+      </w:pPr>
+      <w:r>
+        <w:rPr>
+          <w:rFonts w:ascii="Times New Roman" w:cs="Times New Roman" w:eastAsia="Times New Roman" w:hAnsi="Times New Roman"/>
+          <w:sz w:val="19"/>
+          <w:szCs w:val="19"/>
+        </w:rPr>
+        <w:t xml:space="preserve">Koren, Y., Bell, R., &amp; Volinsky, C. (2009). Matrix factorization techniques for recommender systems. </w:t>
+      </w:r>
+      <w:r>
+        <w:rPr>
+          <w:rFonts w:ascii="Times New Roman" w:cs="Times New Roman" w:eastAsia="Times New Roman" w:hAnsi="Times New Roman"/>
+          <w:i/>
+          <w:iCs/>
+          <w:sz w:val="19"/>
+          <w:szCs w:val="19"/>
+        </w:rPr>
+        <w:t xml:space="preserve">Computer, 42</w:t>
+      </w:r>
+      <w:r>
+        <w:rPr>
+          <w:rFonts w:ascii="Times New Roman" w:cs="Times New Roman" w:eastAsia="Times New Roman" w:hAnsi="Times New Roman"/>
+          <w:sz w:val="19"/>
+          <w:szCs w:val="19"/>
+        </w:rPr>
+        <w:t xml:space="preserve">(8), 30–37. https://doi.org/10.1109/MC.2009.263</w:t>
+      </w:r>
+    </w:p>
+    <w:p>
+      <w:pPr>
+        <w:spacing w:after="110" w:line="250"/>
+        <w:ind w:left="480" w:hanging="480"/>
+      </w:pPr>
+      <w:r>
+        <w:rPr>
+          <w:rFonts w:ascii="Times New Roman" w:cs="Times New Roman" w:eastAsia="Times New Roman" w:hAnsi="Times New Roman"/>
+          <w:sz w:val="19"/>
+          <w:szCs w:val="19"/>
+        </w:rPr>
+        <w:t xml:space="preserve">Meng, Z., McCreadie, R., Macdonald, C., &amp; Ounis, I. (2020). Exploring data splitting strategies for the evaluation of recommendation models. In </w:t>
+      </w:r>
+      <w:r>
+        <w:rPr>
+          <w:rFonts w:ascii="Times New Roman" w:cs="Times New Roman" w:eastAsia="Times New Roman" w:hAnsi="Times New Roman"/>
+          <w:i/>
+          <w:iCs/>
+          <w:sz w:val="19"/>
+          <w:szCs w:val="19"/>
+        </w:rPr>
+        <w:t xml:space="preserve">Proceedings of the 14th ACM Conference on Recommender Systems</w:t>
+      </w:r>
+      <w:r>
+        <w:rPr>
+          <w:rFonts w:ascii="Times New Roman" w:cs="Times New Roman" w:eastAsia="Times New Roman" w:hAnsi="Times New Roman"/>
+          <w:sz w:val="19"/>
+          <w:szCs w:val="19"/>
+        </w:rPr>
+        <w:t xml:space="preserve"> (pp. 681–686). Association for Computing Machinery. https://doi.org/10.1145/3383313.3418479</w:t>
+      </w:r>
+    </w:p>
+    <w:p>
+      <w:pPr>
+        <w:spacing w:after="110" w:line="250"/>
+        <w:ind w:left="480" w:hanging="480"/>
+      </w:pPr>
+      <w:r>
+        <w:rPr>
+          <w:rFonts w:ascii="Times New Roman" w:cs="Times New Roman" w:eastAsia="Times New Roman" w:hAnsi="Times New Roman"/>
+          <w:sz w:val="19"/>
+          <w:szCs w:val="19"/>
+        </w:rPr>
+        <w:t xml:space="preserve">Panda, D. K., &amp; Ray, S. (2022). Approaches and algorithms to mitigate cold start problems in recommender systems: A systematic literature review. </w:t>
+      </w:r>
+      <w:r>
+        <w:rPr>
+          <w:rFonts w:ascii="Times New Roman" w:cs="Times New Roman" w:eastAsia="Times New Roman" w:hAnsi="Times New Roman"/>
+          <w:i/>
+          <w:iCs/>
+          <w:sz w:val="19"/>
+          <w:szCs w:val="19"/>
+        </w:rPr>
+        <w:t xml:space="preserve">Journal of Intelligent Information Systems, 59</w:t>
+      </w:r>
+      <w:r>
+        <w:rPr>
+          <w:rFonts w:ascii="Times New Roman" w:cs="Times New Roman" w:eastAsia="Times New Roman" w:hAnsi="Times New Roman"/>
+          <w:sz w:val="19"/>
+          <w:szCs w:val="19"/>
+        </w:rPr>
+        <w:t xml:space="preserve">(2), 341–366. https://doi.org/10.1007/s10844-022-00698-5</w:t>
+      </w:r>
+    </w:p>
+    <w:p>
+      <w:pPr>
+        <w:spacing w:after="110" w:line="250"/>
+        <w:ind w:left="480" w:hanging="480"/>
+      </w:pPr>
+      <w:r>
+        <w:rPr>
+          <w:rFonts w:ascii="Times New Roman" w:cs="Times New Roman" w:eastAsia="Times New Roman" w:hAnsi="Times New Roman"/>
+          <w:sz w:val="19"/>
+          <w:szCs w:val="19"/>
+        </w:rPr>
+        <w:t xml:space="preserve">Sarwar, B., Karypis, G., Konstan, J., &amp; Riedl, J. (2001). Item-based collaborative filtering recommendation algorithms. In </w:t>
+      </w:r>
+      <w:r>
+        <w:rPr>
+          <w:rFonts w:ascii="Times New Roman" w:cs="Times New Roman" w:eastAsia="Times New Roman" w:hAnsi="Times New Roman"/>
+          <w:i/>
+          <w:iCs/>
+          <w:sz w:val="19"/>
+          <w:szCs w:val="19"/>
+        </w:rPr>
+        <w:t xml:space="preserve">Proceedings of the 10th International Conference on World Wide Web</w:t>
+      </w:r>
+      <w:r>
+        <w:rPr>
+          <w:rFonts w:ascii="Times New Roman" w:cs="Times New Roman" w:eastAsia="Times New Roman" w:hAnsi="Times New Roman"/>
+          <w:sz w:val="19"/>
+          <w:szCs w:val="19"/>
+        </w:rPr>
+        <w:t xml:space="preserve"> (pp. 285–295). Association for Computing Machinery. https://doi.org/10.1145/371920.372071</w:t>
+      </w:r>
+    </w:p>
+    <w:p>
+      <w:pPr>
+        <w:spacing w:after="110" w:line="250"/>
+        <w:ind w:left="480" w:hanging="480"/>
+      </w:pPr>
+      <w:r>
+        <w:rPr>
+          <w:rFonts w:ascii="Times New Roman" w:cs="Times New Roman" w:eastAsia="Times New Roman" w:hAnsi="Times New Roman"/>
+          <w:sz w:val="19"/>
+          <w:szCs w:val="19"/>
+        </w:rPr>
+        <w:t xml:space="preserve">Sedhain, S., Menon, A. K., Sanner, S., &amp; Xie, L. (2015). AutoRec: Autoencoders meet collaborative filtering. In </w:t>
+      </w:r>
+      <w:r>
+        <w:rPr>
+          <w:rFonts w:ascii="Times New Roman" w:cs="Times New Roman" w:eastAsia="Times New Roman" w:hAnsi="Times New Roman"/>
+          <w:i/>
+          <w:iCs/>
+          <w:sz w:val="19"/>
+          <w:szCs w:val="19"/>
+        </w:rPr>
+        <w:t xml:space="preserve">Proceedings of the 24th International Conference on World Wide Web</w:t>
+      </w:r>
+      <w:r>
+        <w:rPr>
+          <w:rFonts w:ascii="Times New Roman" w:cs="Times New Roman" w:eastAsia="Times New Roman" w:hAnsi="Times New Roman"/>
+          <w:sz w:val="19"/>
+          <w:szCs w:val="19"/>
+        </w:rPr>
+        <w:t xml:space="preserve"> (pp. 111–112). Association for Computing Machinery. https://doi.org/10.1145/2740908.2742726</w:t>
       </w:r>
     </w:p>
     <w:p>
@@ -6021,7 +6211,7 @@
           <w:sz w:val="18"/>
           <w:szCs w:val="18"/>
         </w:rPr>
-        <w:t xml:space="preserve">Every entry above needs checking against the original before submission. [6], [8] and [11] were added because they match arguments the report makes; confirm each says what the report claims it says.</w:t>
+        <w:t xml:space="preserve">APA 7, alphabetical, hanging indent. The DOIs for Adomavicius &amp; Kwon, Burke, Cremonesi et al. and Sedhain et al. were checked against the publisher listing; the rest were not. Open every entry before submitting and confirm it says what the report claims it says. Burke, Cremonesi and Adomavicius were added because the report makes arguments those papers support — Burke especially, since "weighted" and "switching" are his terms.</w:t>
       </w:r>
     </w:p>
     <w:p>

</xml_diff>